<commit_message>
Werkdocument in de nieuwe huisstijl: vakken in plaats van lijntjes, puntenvak, geen kopregel of Zo werk je
Opgekuist naar Jonas' eigen versie van Stagemail (12-10-2026): geen naam/klas/datum, geen Zo werk je,
geen uitleg die op de lespagina staat, geen knop Verzenden. Nieuw: logo en puntenvak (/20), A4,
lichtblauwe vakken waarin typen niets doet verschuiven, deel 4 als tabel met de criteria en punten
uit de lesvoorbereiding. De lespagina en de 22 beelden bij de stapjes volgen het nieuwe document.

Co-Authored-By: Claude Opus 5.5 <noreply@anthropic.com>
</commit_message>
<xml_diff>
--- a/werkdocument/Stagemail.docx
+++ b/werkdocument/Stagemail.docx
@@ -2,218 +2,123 @@
 <file path=word/document.xml><?xml version="1.0" encoding="utf-8"?>
 <w:document xmlns:wpc="http://schemas.microsoft.com/office/word/2010/wordprocessingCanvas" xmlns:mo="http://schemas.microsoft.com/office/mac/office/2008/main" xmlns:mc="http://schemas.openxmlformats.org/markup-compatibility/2006" xmlns:mv="urn:schemas-microsoft-com:mac:vml" xmlns:o="urn:schemas-microsoft-com:office:office" xmlns:r="http://schemas.openxmlformats.org/officeDocument/2006/relationships" xmlns:m="http://schemas.openxmlformats.org/officeDocument/2006/math" xmlns:v="urn:schemas-microsoft-com:vml" xmlns:wp14="http://schemas.microsoft.com/office/word/2010/wordprocessingDrawing" xmlns:wp="http://schemas.openxmlformats.org/drawingml/2006/wordprocessingDrawing" xmlns:w10="urn:schemas-microsoft-com:office:word" xmlns:w="http://schemas.openxmlformats.org/wordprocessingml/2006/main" xmlns:w14="http://schemas.microsoft.com/office/word/2010/wordml" xmlns:wpg="http://schemas.microsoft.com/office/word/2010/wordprocessingGroup" xmlns:wpi="http://schemas.microsoft.com/office/word/2010/wordprocessingInk" xmlns:wne="http://schemas.microsoft.com/office/word/2006/wordml" xmlns:wps="http://schemas.microsoft.com/office/word/2010/wordprocessingShape" mc:Ignorable="w14 wp14">
   <w:body>
-    <w:p>
-      <w:r>
-        <w:rPr>
-          <w:b/>
-          <w:color w:val="2A3973"/>
-          <w:sz w:val="44"/>
-        </w:rPr>
-        <w:t>STAGEMAIL</w:t>
-      </w:r>
-    </w:p>
-    <w:p>
-      <w:pPr>
-        <w:spacing w:after="200"/>
-      </w:pPr>
-      <w:r>
-        <w:rPr>
-          <w:b w:val="0"/>
-          <w:i w:val="0"/>
-          <w:color w:val="5F6368"/>
-          <w:sz w:val="19"/>
-        </w:rPr>
-        <w:t>Les 3 — Professionele e-mail aan een stageplaats  ·  Toegepaste Informatica  ·  De Speelboom</w:t>
-      </w:r>
-    </w:p>
     <w:tbl>
       <w:tblPr>
-        <w:tblStyle w:val="TableGrid"/>
         <w:tblW w:type="auto" w:w="0"/>
+        <w:jc w:val="center"/>
         <w:tblLayout w:type="fixed"/>
         <w:tblLook w:firstColumn="1" w:firstRow="1" w:lastColumn="0" w:lastRow="0" w:noHBand="0" w:noVBand="1" w:val="04A0"/>
+        <w:tblBorders>
+          <w:top w:val="nil"/>
+          <w:left w:val="nil"/>
+          <w:bottom w:val="nil"/>
+          <w:right w:val="nil"/>
+          <w:insideH w:val="nil"/>
+          <w:insideV w:val="nil"/>
+        </w:tblBorders>
+        <w:tblLayout w:type="fixed"/>
       </w:tblPr>
       <w:tblGrid>
-        <w:gridCol w:w="3969"/>
-        <w:gridCol w:w="2268"/>
-        <w:gridCol w:w="3402"/>
+        <w:gridCol w:w="2041"/>
+        <w:gridCol w:w="6009"/>
+        <w:gridCol w:w="1587"/>
       </w:tblGrid>
       <w:tr>
+        <w:trPr>
+          <w:trHeight w:val="1134" w:hRule="atLeast"/>
+        </w:trPr>
         <w:tc>
           <w:tcPr>
-            <w:tcW w:type="dxa" w:w="3969"/>
+            <w:tcW w:type="dxa" w:w="2041"/>
+            <w:vAlign w:val="center"/>
           </w:tcPr>
           <w:p>
+            <w:pPr>
+              <w:spacing w:before="0" w:after="0"/>
+            </w:pPr>
             <w:r>
-              <w:rPr>
-                <w:b/>
-              </w:rPr>
-              <w:t xml:space="preserve">Naam: </w:t>
+              <w:drawing>
+                <wp:inline xmlns:a="http://schemas.openxmlformats.org/drawingml/2006/main" xmlns:pic="http://schemas.openxmlformats.org/drawingml/2006/picture">
+                  <wp:extent cx="1152000" cy="713354"/>
+                  <wp:docPr id="1" name="Picture 1"/>
+                  <wp:cNvGraphicFramePr>
+                    <a:graphicFrameLocks noChangeAspect="1"/>
+                  </wp:cNvGraphicFramePr>
+                  <a:graphic>
+                    <a:graphicData uri="http://schemas.openxmlformats.org/drawingml/2006/picture">
+                      <pic:pic>
+                        <pic:nvPicPr>
+                          <pic:cNvPr id="0" name="go-dalton-gent.png"/>
+                          <pic:cNvPicPr/>
+                        </pic:nvPicPr>
+                        <pic:blipFill>
+                          <a:blip r:embed="rId9"/>
+                          <a:stretch>
+                            <a:fillRect/>
+                          </a:stretch>
+                        </pic:blipFill>
+                        <pic:spPr>
+                          <a:xfrm>
+                            <a:off x="0" y="0"/>
+                            <a:ext cx="1152000" cy="713354"/>
+                          </a:xfrm>
+                          <a:prstGeom prst="rect"/>
+                        </pic:spPr>
+                      </pic:pic>
+                    </a:graphicData>
+                  </a:graphic>
+                </wp:inline>
+              </w:drawing>
             </w:r>
           </w:p>
         </w:tc>
         <w:tc>
           <w:tcPr>
-            <w:tcW w:type="dxa" w:w="2268"/>
+            <w:tcW w:type="dxa" w:w="6009"/>
+            <w:vAlign w:val="center"/>
           </w:tcPr>
           <w:p>
+            <w:pPr>
+              <w:spacing w:before="0" w:after="0"/>
+              <w:jc w:val="center"/>
+            </w:pPr>
             <w:r>
               <w:rPr>
+                <w:rFonts w:ascii="Montserrat" w:hAnsi="Montserrat" w:eastAsia="Montserrat"/>
                 <w:b/>
+                <w:i w:val="0"/>
+                <w:color w:val="2A3973"/>
+                <w:sz w:val="44"/>
               </w:rPr>
-              <w:t xml:space="preserve">Klas: </w:t>
+              <w:t>STAGEMAIL</w:t>
             </w:r>
           </w:p>
         </w:tc>
         <w:tc>
           <w:tcPr>
-            <w:tcW w:type="dxa" w:w="3402"/>
-          </w:tcPr>
-          <w:p>
-            <w:r>
-              <w:rPr>
-                <w:b/>
-              </w:rPr>
-              <w:t xml:space="preserve">Datum: </w:t>
-            </w:r>
-          </w:p>
-        </w:tc>
-      </w:tr>
-    </w:tbl>
-    <w:p/>
-    <w:p>
-      <w:pPr>
-        <w:keepNext/>
-        <w:spacing w:before="120" w:after="80"/>
-      </w:pPr>
-      <w:r>
-        <w:rPr>
-          <w:b/>
-          <w:color w:val="2A3973"/>
-          <w:sz w:val="26"/>
-        </w:rPr>
-        <w:t>Zo werk je</w:t>
-      </w:r>
-    </w:p>
-    <w:p>
-      <w:pPr>
-        <w:spacing w:after="40"/>
-      </w:pPr>
-      <w:r>
-        <w:t>1.  Op de lespagina lees je wat je moet doen, stap voor stap.</w:t>
-      </w:r>
-    </w:p>
-    <w:p>
-      <w:pPr>
-        <w:spacing w:after="40"/>
-      </w:pPr>
-      <w:r>
-        <w:t>2.  Je schrijft alles in DIT document. Je hebt niets anders nodig.</w:t>
-      </w:r>
-    </w:p>
-    <w:p>
-      <w:pPr>
-        <w:spacing w:after="40"/>
-      </w:pPr>
-      <w:r>
-        <w:t>3.  Je e-mail schrijf je in deel 3, in een venster dat eruitziet zoals in Gmail.</w:t>
-      </w:r>
-    </w:p>
-    <w:p>
-      <w:pPr>
-        <w:spacing w:after="40"/>
-      </w:pPr>
-      <w:r>
-        <w:t>4.  Klaar? Klik in de opdracht op Inleveren. Er wordt niets echt verstuurd.</w:t>
-      </w:r>
-    </w:p>
-    <w:p>
-      <w:pPr>
-        <w:keepNext/>
-        <w:spacing w:before="280" w:after="80"/>
-      </w:pPr>
-      <w:r>
-        <w:rPr>
-          <w:b/>
-          <w:color w:val="2A3973"/>
-          <w:sz w:val="26"/>
-        </w:rPr>
-        <w:t>Je stage</w:t>
-      </w:r>
-    </w:p>
-    <w:tbl>
-      <w:tblPr>
-        <w:tblW w:type="auto" w:w="0"/>
-        <w:tblLayout w:type="fixed"/>
-        <w:tblLook w:firstColumn="1" w:firstRow="1" w:lastColumn="0" w:lastRow="0" w:noHBand="0" w:noVBand="1" w:val="04A0"/>
-        <w:tblBorders>
-          <w:top w:val="single" w:sz="8" w:color="A7B1DE"/>
-          <w:left w:val="single" w:sz="8" w:color="A7B1DE"/>
-          <w:bottom w:val="single" w:sz="8" w:color="A7B1DE"/>
-          <w:right w:val="single" w:sz="8" w:color="A7B1DE"/>
-          <w:insideH w:val="nil"/>
-          <w:insideV w:val="nil"/>
-        </w:tblBorders>
-      </w:tblPr>
-      <w:tblGrid>
-        <w:gridCol w:w="9638"/>
-      </w:tblGrid>
-      <w:tr>
-        <w:tc>
-          <w:tcPr>
-            <w:tcW w:type="dxa" w:w="9638"/>
-            <w:shd w:val="clear" w:fill="EEF0F9"/>
+            <w:tcW w:type="dxa" w:w="1587"/>
+            <w:vAlign w:val="center"/>
+            <w:tcBorders>
+              <w:top w:val="single" w:sz="12" w:space="0" w:color="3C51A0"/>
+              <w:left w:val="single" w:sz="12" w:space="0" w:color="3C51A0"/>
+              <w:bottom w:val="single" w:sz="12" w:space="0" w:color="3C51A0"/>
+              <w:right w:val="single" w:sz="12" w:space="0" w:color="3C51A0"/>
+            </w:tcBorders>
           </w:tcPr>
           <w:p>
             <w:pPr>
-              <w:spacing w:after="80"/>
-            </w:pPr>
-            <w:r/>
-            <w:r>
-              <w:t>Je loopt stage in buitenschoolse opvang De Speelboom, van maandag 16 november tot vrijdag 4 december 2026. Je kent daar nog niemand.</w:t>
-            </w:r>
-          </w:p>
-          <w:p>
-            <w:pPr>
-              <w:spacing w:after="80"/>
+              <w:spacing w:before="0" w:after="0"/>
+              <w:jc w:val="right"/>
             </w:pPr>
             <w:r>
               <w:rPr>
+                <w:rFonts w:ascii="Montserrat" w:hAnsi="Montserrat" w:eastAsia="Montserrat"/>
                 <w:b/>
+                <w:i w:val="0"/>
+                <w:color w:val="3C51A0"/>
+                <w:sz w:val="36"/>
               </w:rPr>
-              <w:t>Je mentor op De Speelboom:  mevrouw Lien Verhoeven  —  lien.verhoeven@despeelboom.example</w:t>
-            </w:r>
-          </w:p>
-          <w:p>
-            <w:pPr>
-              <w:spacing w:after="80"/>
-            </w:pPr>
-            <w:r>
-              <w:rPr>
-                <w:b/>
-              </w:rPr>
-              <w:t>Je stagebegeleider van school:  mevrouw Ilse Wouters  —  ilse.wouters@school.example</w:t>
-            </w:r>
-          </w:p>
-          <w:p>
-            <w:pPr>
-              <w:spacing w:after="80"/>
-            </w:pPr>
-            <w:r>
-              <w:t>Je opdracht: stuur je mentor een e-mail om kennis te maken. Vraag wanneer je eens kan langskomen. Je stagebegeleider wil meelezen.</w:t>
-            </w:r>
-          </w:p>
-          <w:p>
-            <w:pPr>
-              <w:spacing w:after="80"/>
-            </w:pPr>
-            <w:r>
-              <w:rPr>
-                <w:i/>
-                <w:color w:val="5F6368"/>
-                <w:sz w:val="18"/>
-              </w:rPr>
-              <w:t>Alle namen en adressen zijn verzonnen.</w:t>
+              <w:t>/ 20</w:t>
             </w:r>
           </w:p>
         </w:tc>
@@ -221,372 +126,134 @@
     </w:tbl>
     <w:p>
       <w:pPr>
-        <w:keepNext/>
-        <w:spacing w:before="280" w:after="80"/>
+        <w:spacing w:before="0" w:after="0" w:line="200" w:lineRule="exact"/>
+        <w:rPr>
+          <w:sz w:val="10"/>
+        </w:rPr>
       </w:pPr>
-      <w:r>
-        <w:rPr>
-          <w:b/>
-          <w:color w:val="2A3973"/>
-          <w:sz w:val="32"/>
-        </w:rPr>
-        <w:t>Deel 1 — Wat is er mis met de e-mail van Kobe?</w:t>
-      </w:r>
-    </w:p>
-    <w:p>
-      <w:pPr>
-        <w:spacing w:after="120"/>
-      </w:pPr>
-      <w:r>
-        <w:rPr>
-          <w:b w:val="0"/>
-          <w:i w:val="0"/>
-          <w:color w:val="5F6368"/>
-          <w:sz w:val="19"/>
-        </w:rPr>
-        <w:t>De e-mail van Kobe staat op de lespagina, in stap 2. Schrijf drie fouten op, en hoe het beter kan. De eerste deed je leraar voor.</w:t>
-      </w:r>
     </w:p>
     <w:tbl>
       <w:tblPr>
-        <w:tblStyle w:val="TableGrid"/>
         <w:tblW w:type="auto" w:w="0"/>
         <w:jc w:val="center"/>
         <w:tblLayout w:type="fixed"/>
         <w:tblLook w:firstColumn="1" w:firstRow="1" w:lastColumn="0" w:lastRow="0" w:noHBand="0" w:noVBand="1" w:val="04A0"/>
+        <w:tblBorders>
+          <w:top w:val="single" w:sz="6" w:space="0" w:color="A7B1DE"/>
+          <w:left w:val="single" w:sz="6" w:space="0" w:color="A7B1DE"/>
+          <w:bottom w:val="single" w:sz="6" w:space="0" w:color="A7B1DE"/>
+          <w:right w:val="single" w:sz="6" w:space="0" w:color="A7B1DE"/>
+          <w:insideH w:val="nil"/>
+          <w:insideV w:val="nil"/>
+        </w:tblBorders>
+        <w:tblLayout w:type="fixed"/>
       </w:tblPr>
       <w:tblGrid>
-        <w:gridCol w:w="454"/>
-        <w:gridCol w:w="4309"/>
-        <w:gridCol w:w="4876"/>
+        <w:gridCol w:w="9638"/>
       </w:tblGrid>
       <w:tr>
+        <w:trPr>
+          <w:cantSplit/>
+        </w:trPr>
         <w:tc>
           <w:tcPr>
-            <w:tcW w:type="dxa" w:w="454"/>
-            <w:shd w:val="clear" w:fill="E4E8F6"/>
+            <w:tcW w:type="dxa" w:w="9638"/>
+            <w:shd w:val="clear" w:color="auto" w:fill="EEF0F9"/>
+            <w:tcMar>
+              <w:top w:w="113" w:type="dxa"/>
+              <w:left w:w="170" w:type="dxa"/>
+              <w:bottom w:w="113" w:type="dxa"/>
+              <w:right w:w="170" w:type="dxa"/>
+            </w:tcMar>
           </w:tcPr>
           <w:p>
-            <w:r/>
+            <w:pPr>
+              <w:spacing w:after="80"/>
+            </w:pPr>
+            <w:r>
+              <w:rPr>
+                <w:rFonts w:ascii="Montserrat" w:hAnsi="Montserrat" w:eastAsia="Montserrat"/>
+                <w:b/>
+                <w:i w:val="0"/>
+                <w:color w:val="2A3973"/>
+                <w:sz w:val="22"/>
+              </w:rPr>
+              <w:t>Je stage</w:t>
+            </w:r>
           </w:p>
-        </w:tc>
-        <w:tc>
-          <w:tcPr>
-            <w:tcW w:type="dxa" w:w="4309"/>
-            <w:shd w:val="clear" w:fill="E4E8F6"/>
-          </w:tcPr>
           <w:p>
+            <w:pPr>
+              <w:spacing w:after="60"/>
+            </w:pPr>
+            <w:r>
+              <w:t>Je loopt stage in buitenschoolse opvang De Speelboom, van maandag 16 november tot vrijdag 4 december 2026. Je kent daar nog niemand.</w:t>
+            </w:r>
+          </w:p>
+          <w:p>
+            <w:pPr>
+              <w:spacing w:after="60"/>
+            </w:pPr>
             <w:r>
               <w:rPr>
                 <w:b/>
               </w:rPr>
-              <w:t>Wat is er mis?</w:t>
+              <w:t xml:space="preserve">Je mentor:  </w:t>
+            </w:r>
+            <w:r>
+              <w:t>mevrouw Lien Verhoeven  —  lien.verhoeven@despeelboom.example</w:t>
             </w:r>
           </w:p>
-        </w:tc>
-        <w:tc>
-          <w:tcPr>
-            <w:tcW w:type="dxa" w:w="4876"/>
-            <w:shd w:val="clear" w:fill="E4E8F6"/>
-          </w:tcPr>
           <w:p>
+            <w:pPr>
+              <w:spacing w:after="60"/>
+            </w:pPr>
             <w:r>
               <w:rPr>
                 <w:b/>
               </w:rPr>
-              <w:t>Zo is het beter</w:t>
+              <w:t xml:space="preserve">Je stagebegeleider van school:  </w:t>
+            </w:r>
+            <w:r>
+              <w:t>mevrouw Ilse Wouters  —  ilse.wouters@school.example</w:t>
+            </w:r>
+          </w:p>
+          <w:p>
+            <w:pPr>
+              <w:spacing w:after="60"/>
+            </w:pPr>
+            <w:r>
+              <w:t>Je opdracht: stuur je mentor een e-mail om kennis te maken. Vraag wanneer je eens kan langskomen. Je stagebegeleider wil meelezen.</w:t>
             </w:r>
           </w:p>
         </w:tc>
       </w:tr>
-      <w:tr>
-        <w:trPr>
-          <w:trHeight w:val="623" w:hRule="atLeast"/>
-        </w:trPr>
-        <w:tc>
-          <w:tcPr>
-            <w:tcW w:type="dxa" w:w="454"/>
-          </w:tcPr>
-          <w:p>
-            <w:r>
-              <w:t>1</w:t>
-            </w:r>
-          </w:p>
-        </w:tc>
-        <w:tc>
-          <w:tcPr>
-            <w:tcW w:type="dxa" w:w="4309"/>
-          </w:tcPr>
-          <w:p>
-            <w:r>
-              <w:t>Er is geen onderwerp.</w:t>
-            </w:r>
-          </w:p>
-        </w:tc>
-        <w:tc>
-          <w:tcPr>
-            <w:tcW w:type="dxa" w:w="4876"/>
-          </w:tcPr>
-          <w:p>
-            <w:r>
-              <w:t>Kennismaking stagiair Kobe Martens – stage vanaf 16 november</w:t>
-            </w:r>
-          </w:p>
-        </w:tc>
-      </w:tr>
-      <w:tr>
-        <w:trPr>
-          <w:trHeight w:val="623" w:hRule="atLeast"/>
-        </w:trPr>
-        <w:tc>
-          <w:tcPr>
-            <w:tcW w:type="dxa" w:w="454"/>
-          </w:tcPr>
-          <w:p>
-            <w:r>
-              <w:t>2</w:t>
-            </w:r>
-          </w:p>
-        </w:tc>
-        <w:tc>
-          <w:tcPr>
-            <w:tcW w:type="dxa" w:w="4309"/>
-          </w:tcPr>
-          <w:p>
-            <w:r/>
-          </w:p>
-        </w:tc>
-        <w:tc>
-          <w:tcPr>
-            <w:tcW w:type="dxa" w:w="4876"/>
-          </w:tcPr>
-          <w:p>
-            <w:r/>
-          </w:p>
-        </w:tc>
-      </w:tr>
-      <w:tr>
-        <w:trPr>
-          <w:trHeight w:val="623" w:hRule="atLeast"/>
-        </w:trPr>
-        <w:tc>
-          <w:tcPr>
-            <w:tcW w:type="dxa" w:w="454"/>
-          </w:tcPr>
-          <w:p>
-            <w:r>
-              <w:t>3</w:t>
-            </w:r>
-          </w:p>
-        </w:tc>
-        <w:tc>
-          <w:tcPr>
-            <w:tcW w:type="dxa" w:w="4309"/>
-          </w:tcPr>
-          <w:p>
-            <w:r/>
-          </w:p>
-        </w:tc>
-        <w:tc>
-          <w:tcPr>
-            <w:tcW w:type="dxa" w:w="4876"/>
-          </w:tcPr>
-          <w:p>
-            <w:r/>
-          </w:p>
-        </w:tc>
-      </w:tr>
     </w:tbl>
-    <w:p/>
     <w:p>
       <w:pPr>
-        <w:keepNext/>
-        <w:spacing w:before="280" w:after="80"/>
+        <w:spacing w:before="0" w:after="0" w:line="80" w:lineRule="exact"/>
+        <w:rPr>
+          <w:sz w:val="4"/>
+        </w:rPr>
       </w:pPr>
-      <w:r>
-        <w:rPr>
-          <w:b/>
-          <w:color w:val="2A3973"/>
-          <w:sz w:val="32"/>
-        </w:rPr>
-        <w:t>Deel 2 — Aan, Cc of Bcc?</w:t>
-      </w:r>
-    </w:p>
-    <w:p>
-      <w:pPr>
-        <w:spacing w:after="120"/>
-      </w:pPr>
-      <w:r>
-        <w:rPr>
-          <w:b w:val="0"/>
-          <w:i w:val="0"/>
-          <w:color w:val="5F6368"/>
-          <w:sz w:val="19"/>
-        </w:rPr>
-        <w:t>Schrijf bij elke situatie Aan, Cc of Bcc.</w:t>
-      </w:r>
-    </w:p>
-    <w:tbl>
-      <w:tblPr>
-        <w:tblStyle w:val="TableGrid"/>
-        <w:tblW w:type="auto" w:w="0"/>
-        <w:jc w:val="center"/>
-        <w:tblLayout w:type="fixed"/>
-        <w:tblLook w:firstColumn="1" w:firstRow="1" w:lastColumn="0" w:lastRow="0" w:noHBand="0" w:noVBand="1" w:val="04A0"/>
-      </w:tblPr>
-      <w:tblGrid>
-        <w:gridCol w:w="7087"/>
-        <w:gridCol w:w="2551"/>
-      </w:tblGrid>
-      <w:tr>
-        <w:tc>
-          <w:tcPr>
-            <w:tcW w:type="dxa" w:w="7087"/>
-            <w:shd w:val="clear" w:fill="E4E8F6"/>
-          </w:tcPr>
-          <w:p>
-            <w:r>
-              <w:rPr>
-                <w:b/>
-              </w:rPr>
-              <w:t>Situatie</w:t>
-            </w:r>
-          </w:p>
-        </w:tc>
-        <w:tc>
-          <w:tcPr>
-            <w:tcW w:type="dxa" w:w="2551"/>
-            <w:shd w:val="clear" w:fill="E4E8F6"/>
-          </w:tcPr>
-          <w:p>
-            <w:r>
-              <w:rPr>
-                <w:b/>
-              </w:rPr>
-              <w:t>Aan, Cc of Bcc?</w:t>
-            </w:r>
-          </w:p>
-        </w:tc>
-      </w:tr>
-      <w:tr>
-        <w:trPr>
-          <w:trHeight w:val="510" w:hRule="atLeast"/>
-        </w:trPr>
-        <w:tc>
-          <w:tcPr>
-            <w:tcW w:type="dxa" w:w="7087"/>
-          </w:tcPr>
-          <w:p>
-            <w:r>
-              <w:t>a.  Je mailt je mentor. Zij moet je vraag beantwoorden.</w:t>
-            </w:r>
-          </w:p>
-        </w:tc>
-        <w:tc>
-          <w:tcPr>
-            <w:tcW w:type="dxa" w:w="2551"/>
-          </w:tcPr>
-          <w:p/>
-        </w:tc>
-      </w:tr>
-      <w:tr>
-        <w:trPr>
-          <w:trHeight w:val="510" w:hRule="atLeast"/>
-        </w:trPr>
-        <w:tc>
-          <w:tcPr>
-            <w:tcW w:type="dxa" w:w="7087"/>
-          </w:tcPr>
-          <w:p>
-            <w:r>
-              <w:t>b.  Je stagebegeleider van school wil je e-mail lezen, maar moet zelf niets doen.</w:t>
-            </w:r>
-          </w:p>
-        </w:tc>
-        <w:tc>
-          <w:tcPr>
-            <w:tcW w:type="dxa" w:w="2551"/>
-          </w:tcPr>
-          <w:p/>
-        </w:tc>
-      </w:tr>
-      <w:tr>
-        <w:trPr>
-          <w:trHeight w:val="510" w:hRule="atLeast"/>
-        </w:trPr>
-        <w:tc>
-          <w:tcPr>
-            <w:tcW w:type="dxa" w:w="7087"/>
-          </w:tcPr>
-          <w:p>
-            <w:r>
-              <w:t>c.  De Speelboom stuurt één e-mail naar de ouders van alle 20 kinderen. De ouders mogen elkaars e-mailadres niet zien.</w:t>
-            </w:r>
-          </w:p>
-        </w:tc>
-        <w:tc>
-          <w:tcPr>
-            <w:tcW w:type="dxa" w:w="2551"/>
-          </w:tcPr>
-          <w:p/>
-        </w:tc>
-      </w:tr>
-    </w:tbl>
-    <w:p/>
-    <w:p>
-      <w:pPr>
-        <w:spacing w:after="120"/>
-      </w:pPr>
-      <w:r>
-        <w:rPr>
-          <w:b/>
-          <w:i w:val="0"/>
-        </w:rPr>
-        <w:t>Vraag 1. Waarom mogen de ouders in situatie c elkaars e-mailadres niet zien?</w:t>
-      </w:r>
-    </w:p>
-    <w:p>
-      <w:pPr>
-        <w:spacing w:after="40"/>
-      </w:pPr>
-      <w:r>
-        <w:t>______________________________________________________________________</w:t>
-      </w:r>
-    </w:p>
-    <w:p>
-      <w:pPr>
-        <w:spacing w:after="40"/>
-      </w:pPr>
-      <w:r>
-        <w:t>______________________________________________________________________</w:t>
-      </w:r>
     </w:p>
     <w:p>
       <w:pPr>
         <w:keepNext/>
-        <w:spacing w:before="280" w:after="80"/>
+        <w:pageBreakBefore w:val="0"/>
+        <w:spacing w:before="280" w:after="160"/>
+        <w:pBdr>
+          <w:bottom w:val="single" w:sz="6" w:space="3" w:color="A7B1DE"/>
+        </w:pBdr>
       </w:pPr>
       <w:r>
         <w:rPr>
+          <w:rFonts w:ascii="Montserrat" w:hAnsi="Montserrat" w:eastAsia="Montserrat"/>
           <w:b/>
+          <w:i w:val="0"/>
           <w:color w:val="2A3973"/>
-          <w:sz w:val="32"/>
+          <w:sz w:val="28"/>
         </w:rPr>
-        <w:t>Deel 3 — Mijn e-mail aan mijn mentor</w:t>
-      </w:r>
-    </w:p>
-    <w:p>
-      <w:pPr>
-        <w:spacing w:after="120"/>
-      </w:pPr>
-      <w:r>
-        <w:rPr>
-          <w:b w:val="0"/>
-          <w:i w:val="0"/>
-          <w:color w:val="5F6368"/>
-          <w:sz w:val="19"/>
-        </w:rPr>
-        <w:t>Klik in een vak en typ. De grijze woorden links zeggen wat in elk vak hoort. Laat Bcc leeg.</w:t>
+        <w:t>Deel 1 — Wat is er mis met de e-mail van Kobe?</w:t>
       </w:r>
     </w:p>
     <w:tbl>
@@ -596,30 +263,577 @@
         <w:tblLayout w:type="fixed"/>
         <w:tblLook w:firstColumn="1" w:firstRow="1" w:lastColumn="0" w:lastRow="0" w:noHBand="0" w:noVBand="1" w:val="04A0"/>
         <w:tblBorders>
-          <w:top w:val="single" w:sz="8" w:color="9AA0A6"/>
-          <w:left w:val="single" w:sz="8" w:color="9AA0A6"/>
-          <w:bottom w:val="single" w:sz="8" w:color="9AA0A6"/>
-          <w:right w:val="single" w:sz="8" w:color="9AA0A6"/>
-          <w:insideH w:val="nil"/>
-          <w:insideV w:val="nil"/>
+          <w:top w:val="single" w:sz="6" w:space="0" w:color="A7B1DE"/>
+          <w:left w:val="single" w:sz="6" w:space="0" w:color="A7B1DE"/>
+          <w:bottom w:val="single" w:sz="6" w:space="0" w:color="A7B1DE"/>
+          <w:right w:val="single" w:sz="6" w:space="0" w:color="A7B1DE"/>
+          <w:insideH w:val="single" w:sz="6" w:space="0" w:color="D5DAEE"/>
+          <w:insideV w:val="single" w:sz="6" w:space="0" w:color="D5DAEE"/>
         </w:tblBorders>
+        <w:tblLayout w:type="fixed"/>
+      </w:tblPr>
+      <w:tblGrid>
+        <w:gridCol w:w="454"/>
+        <w:gridCol w:w="4195"/>
+        <w:gridCol w:w="4989"/>
+      </w:tblGrid>
+      <w:tr>
+        <w:trPr>
+          <w:cantSplit/>
+        </w:trPr>
+        <w:tc>
+          <w:tcPr>
+            <w:tcW w:type="dxa" w:w="454"/>
+            <w:shd w:val="clear" w:color="auto" w:fill="E4E8F6"/>
+          </w:tcPr>
+          <w:p>
+            <w:pPr>
+              <w:spacing w:before="0" w:after="0"/>
+            </w:pPr>
+            <w:r/>
+          </w:p>
+        </w:tc>
+        <w:tc>
+          <w:tcPr>
+            <w:tcW w:type="dxa" w:w="4195"/>
+            <w:shd w:val="clear" w:color="auto" w:fill="E4E8F6"/>
+          </w:tcPr>
+          <w:p>
+            <w:pPr>
+              <w:spacing w:before="0" w:after="0"/>
+            </w:pPr>
+            <w:r/>
+            <w:r>
+              <w:rPr>
+                <w:b/>
+                <w:i w:val="0"/>
+                <w:color w:val="2A3973"/>
+                <w:sz w:val="22"/>
+              </w:rPr>
+              <w:t>Wat is er mis?</w:t>
+            </w:r>
+          </w:p>
+        </w:tc>
+        <w:tc>
+          <w:tcPr>
+            <w:tcW w:type="dxa" w:w="4989"/>
+            <w:shd w:val="clear" w:color="auto" w:fill="E4E8F6"/>
+          </w:tcPr>
+          <w:p>
+            <w:pPr>
+              <w:spacing w:before="0" w:after="0"/>
+            </w:pPr>
+            <w:r/>
+            <w:r>
+              <w:rPr>
+                <w:b/>
+                <w:i w:val="0"/>
+                <w:color w:val="2A3973"/>
+                <w:sz w:val="22"/>
+              </w:rPr>
+              <w:t>Zo is het beter</w:t>
+            </w:r>
+          </w:p>
+        </w:tc>
+      </w:tr>
+      <w:tr>
+        <w:trPr>
+          <w:trHeight w:val="737" w:hRule="atLeast"/>
+          <w:cantSplit/>
+        </w:trPr>
+        <w:tc>
+          <w:tcPr>
+            <w:tcW w:type="dxa" w:w="454"/>
+            <w:vAlign w:val="center"/>
+          </w:tcPr>
+          <w:p>
+            <w:pPr>
+              <w:spacing w:before="0" w:after="0"/>
+            </w:pPr>
+            <w:r/>
+            <w:r>
+              <w:rPr>
+                <w:b w:val="0"/>
+                <w:i w:val="0"/>
+                <w:color w:val="5F6368"/>
+              </w:rPr>
+              <w:t>1</w:t>
+            </w:r>
+          </w:p>
+        </w:tc>
+        <w:tc>
+          <w:tcPr>
+            <w:tcW w:type="dxa" w:w="4195"/>
+            <w:vAlign w:val="center"/>
+          </w:tcPr>
+          <w:p>
+            <w:pPr>
+              <w:spacing w:before="0" w:after="0"/>
+            </w:pPr>
+            <w:r/>
+            <w:r>
+              <w:rPr>
+                <w:b w:val="0"/>
+                <w:i/>
+                <w:color w:val="5F6368"/>
+              </w:rPr>
+              <w:t>Er is geen onderwerp.</w:t>
+            </w:r>
+          </w:p>
+        </w:tc>
+        <w:tc>
+          <w:tcPr>
+            <w:tcW w:type="dxa" w:w="4989"/>
+            <w:vAlign w:val="center"/>
+          </w:tcPr>
+          <w:p>
+            <w:pPr>
+              <w:spacing w:before="0" w:after="0"/>
+            </w:pPr>
+            <w:r/>
+            <w:r>
+              <w:rPr>
+                <w:b w:val="0"/>
+                <w:i/>
+                <w:color w:val="5F6368"/>
+              </w:rPr>
+              <w:t>Kennismaking stagiair Kobe Martens – stage vanaf 16 november</w:t>
+            </w:r>
+          </w:p>
+        </w:tc>
+      </w:tr>
+      <w:tr>
+        <w:trPr>
+          <w:trHeight w:val="737" w:hRule="atLeast"/>
+          <w:cantSplit/>
+        </w:trPr>
+        <w:tc>
+          <w:tcPr>
+            <w:tcW w:type="dxa" w:w="454"/>
+            <w:vAlign w:val="center"/>
+          </w:tcPr>
+          <w:p>
+            <w:pPr>
+              <w:spacing w:before="0" w:after="0"/>
+            </w:pPr>
+            <w:r/>
+            <w:r>
+              <w:rPr>
+                <w:b w:val="0"/>
+                <w:i w:val="0"/>
+              </w:rPr>
+              <w:t>2</w:t>
+            </w:r>
+          </w:p>
+        </w:tc>
+        <w:tc>
+          <w:tcPr>
+            <w:tcW w:type="dxa" w:w="4195"/>
+            <w:vAlign w:val="center"/>
+            <w:shd w:val="clear" w:color="auto" w:fill="F3F5FC"/>
+          </w:tcPr>
+          <w:p>
+            <w:pPr>
+              <w:spacing w:before="0" w:after="0"/>
+            </w:pPr>
+          </w:p>
+        </w:tc>
+        <w:tc>
+          <w:tcPr>
+            <w:tcW w:type="dxa" w:w="4989"/>
+            <w:vAlign w:val="center"/>
+            <w:shd w:val="clear" w:color="auto" w:fill="F3F5FC"/>
+          </w:tcPr>
+          <w:p>
+            <w:pPr>
+              <w:spacing w:before="0" w:after="0"/>
+            </w:pPr>
+          </w:p>
+        </w:tc>
+      </w:tr>
+      <w:tr>
+        <w:trPr>
+          <w:trHeight w:val="737" w:hRule="atLeast"/>
+          <w:cantSplit/>
+        </w:trPr>
+        <w:tc>
+          <w:tcPr>
+            <w:tcW w:type="dxa" w:w="454"/>
+            <w:vAlign w:val="center"/>
+          </w:tcPr>
+          <w:p>
+            <w:pPr>
+              <w:spacing w:before="0" w:after="0"/>
+            </w:pPr>
+            <w:r/>
+            <w:r>
+              <w:rPr>
+                <w:b w:val="0"/>
+                <w:i w:val="0"/>
+              </w:rPr>
+              <w:t>3</w:t>
+            </w:r>
+          </w:p>
+        </w:tc>
+        <w:tc>
+          <w:tcPr>
+            <w:tcW w:type="dxa" w:w="4195"/>
+            <w:vAlign w:val="center"/>
+            <w:shd w:val="clear" w:color="auto" w:fill="F3F5FC"/>
+          </w:tcPr>
+          <w:p>
+            <w:pPr>
+              <w:spacing w:before="0" w:after="0"/>
+            </w:pPr>
+          </w:p>
+        </w:tc>
+        <w:tc>
+          <w:tcPr>
+            <w:tcW w:type="dxa" w:w="4989"/>
+            <w:vAlign w:val="center"/>
+            <w:shd w:val="clear" w:color="auto" w:fill="F3F5FC"/>
+          </w:tcPr>
+          <w:p>
+            <w:pPr>
+              <w:spacing w:before="0" w:after="0"/>
+            </w:pPr>
+          </w:p>
+        </w:tc>
+      </w:tr>
+    </w:tbl>
+    <w:p>
+      <w:pPr>
+        <w:spacing w:before="0" w:after="0" w:line="80" w:lineRule="exact"/>
+        <w:rPr>
+          <w:sz w:val="4"/>
+        </w:rPr>
+      </w:pPr>
+    </w:p>
+    <w:p>
+      <w:pPr>
+        <w:keepNext/>
+        <w:pageBreakBefore w:val="0"/>
+        <w:spacing w:before="280" w:after="160"/>
+        <w:pBdr>
+          <w:bottom w:val="single" w:sz="6" w:space="3" w:color="A7B1DE"/>
+        </w:pBdr>
+      </w:pPr>
+      <w:r>
+        <w:rPr>
+          <w:rFonts w:ascii="Montserrat" w:hAnsi="Montserrat" w:eastAsia="Montserrat"/>
+          <w:b/>
+          <w:i w:val="0"/>
+          <w:color w:val="2A3973"/>
+          <w:sz w:val="28"/>
+        </w:rPr>
+        <w:t>Deel 2 — Aan, Cc of Bcc?</w:t>
+      </w:r>
+    </w:p>
+    <w:tbl>
+      <w:tblPr>
+        <w:tblW w:type="auto" w:w="0"/>
+        <w:jc w:val="center"/>
+        <w:tblLayout w:type="fixed"/>
+        <w:tblLook w:firstColumn="1" w:firstRow="1" w:lastColumn="0" w:lastRow="0" w:noHBand="0" w:noVBand="1" w:val="04A0"/>
+        <w:tblBorders>
+          <w:top w:val="single" w:sz="6" w:space="0" w:color="A7B1DE"/>
+          <w:left w:val="single" w:sz="6" w:space="0" w:color="A7B1DE"/>
+          <w:bottom w:val="single" w:sz="6" w:space="0" w:color="A7B1DE"/>
+          <w:right w:val="single" w:sz="6" w:space="0" w:color="A7B1DE"/>
+          <w:insideH w:val="single" w:sz="6" w:space="0" w:color="D5DAEE"/>
+          <w:insideV w:val="single" w:sz="6" w:space="0" w:color="D5DAEE"/>
+        </w:tblBorders>
+        <w:tblLayout w:type="fixed"/>
+      </w:tblPr>
+      <w:tblGrid>
+        <w:gridCol w:w="7143"/>
+        <w:gridCol w:w="2494"/>
+      </w:tblGrid>
+      <w:tr>
+        <w:trPr>
+          <w:cantSplit/>
+        </w:trPr>
+        <w:tc>
+          <w:tcPr>
+            <w:tcW w:type="dxa" w:w="7143"/>
+            <w:shd w:val="clear" w:color="auto" w:fill="E4E8F6"/>
+          </w:tcPr>
+          <w:p>
+            <w:pPr>
+              <w:spacing w:before="0" w:after="0"/>
+            </w:pPr>
+            <w:r/>
+            <w:r>
+              <w:rPr>
+                <w:b/>
+                <w:i w:val="0"/>
+                <w:color w:val="2A3973"/>
+                <w:sz w:val="22"/>
+              </w:rPr>
+              <w:t>Situatie</w:t>
+            </w:r>
+          </w:p>
+        </w:tc>
+        <w:tc>
+          <w:tcPr>
+            <w:tcW w:type="dxa" w:w="2494"/>
+            <w:shd w:val="clear" w:color="auto" w:fill="E4E8F6"/>
+          </w:tcPr>
+          <w:p>
+            <w:pPr>
+              <w:spacing w:before="0" w:after="0"/>
+            </w:pPr>
+            <w:r/>
+            <w:r>
+              <w:rPr>
+                <w:b/>
+                <w:i w:val="0"/>
+                <w:color w:val="2A3973"/>
+                <w:sz w:val="22"/>
+              </w:rPr>
+              <w:t>Aan, Cc of Bcc?</w:t>
+            </w:r>
+          </w:p>
+        </w:tc>
+      </w:tr>
+      <w:tr>
+        <w:trPr>
+          <w:trHeight w:val="567" w:hRule="atLeast"/>
+          <w:cantSplit/>
+        </w:trPr>
+        <w:tc>
+          <w:tcPr>
+            <w:tcW w:type="dxa" w:w="7143"/>
+            <w:vAlign w:val="center"/>
+          </w:tcPr>
+          <w:p>
+            <w:pPr>
+              <w:spacing w:before="0" w:after="0"/>
+            </w:pPr>
+            <w:r/>
+            <w:r>
+              <w:rPr>
+                <w:b w:val="0"/>
+                <w:i w:val="0"/>
+              </w:rPr>
+              <w:t>a.  Je mailt je mentor. Zij moet je vraag beantwoorden.</w:t>
+            </w:r>
+          </w:p>
+        </w:tc>
+        <w:tc>
+          <w:tcPr>
+            <w:tcW w:type="dxa" w:w="2494"/>
+            <w:vAlign w:val="center"/>
+            <w:shd w:val="clear" w:color="auto" w:fill="F3F5FC"/>
+          </w:tcPr>
+          <w:p>
+            <w:pPr>
+              <w:spacing w:before="0" w:after="0"/>
+            </w:pPr>
+          </w:p>
+        </w:tc>
+      </w:tr>
+      <w:tr>
+        <w:trPr>
+          <w:trHeight w:val="567" w:hRule="atLeast"/>
+          <w:cantSplit/>
+        </w:trPr>
+        <w:tc>
+          <w:tcPr>
+            <w:tcW w:type="dxa" w:w="7143"/>
+            <w:vAlign w:val="center"/>
+          </w:tcPr>
+          <w:p>
+            <w:pPr>
+              <w:spacing w:before="0" w:after="0"/>
+            </w:pPr>
+            <w:r/>
+            <w:r>
+              <w:rPr>
+                <w:b w:val="0"/>
+                <w:i w:val="0"/>
+              </w:rPr>
+              <w:t>b.  Je stagebegeleider van school wil je e-mail lezen, maar moet zelf niets doen.</w:t>
+            </w:r>
+          </w:p>
+        </w:tc>
+        <w:tc>
+          <w:tcPr>
+            <w:tcW w:type="dxa" w:w="2494"/>
+            <w:vAlign w:val="center"/>
+            <w:shd w:val="clear" w:color="auto" w:fill="F3F5FC"/>
+          </w:tcPr>
+          <w:p>
+            <w:pPr>
+              <w:spacing w:before="0" w:after="0"/>
+            </w:pPr>
+          </w:p>
+        </w:tc>
+      </w:tr>
+      <w:tr>
+        <w:trPr>
+          <w:trHeight w:val="567" w:hRule="atLeast"/>
+          <w:cantSplit/>
+        </w:trPr>
+        <w:tc>
+          <w:tcPr>
+            <w:tcW w:type="dxa" w:w="7143"/>
+            <w:vAlign w:val="center"/>
+          </w:tcPr>
+          <w:p>
+            <w:pPr>
+              <w:spacing w:before="0" w:after="0"/>
+            </w:pPr>
+            <w:r/>
+            <w:r>
+              <w:rPr>
+                <w:b w:val="0"/>
+                <w:i w:val="0"/>
+              </w:rPr>
+              <w:t>c.  De Speelboom stuurt één e-mail naar de ouders van alle 20 kinderen. De ouders mogen elkaars e-mailadres niet zien.</w:t>
+            </w:r>
+          </w:p>
+        </w:tc>
+        <w:tc>
+          <w:tcPr>
+            <w:tcW w:type="dxa" w:w="2494"/>
+            <w:vAlign w:val="center"/>
+            <w:shd w:val="clear" w:color="auto" w:fill="F3F5FC"/>
+          </w:tcPr>
+          <w:p>
+            <w:pPr>
+              <w:spacing w:before="0" w:after="0"/>
+            </w:pPr>
+          </w:p>
+        </w:tc>
+      </w:tr>
+    </w:tbl>
+    <w:p>
+      <w:pPr>
+        <w:spacing w:before="0" w:after="0" w:line="80" w:lineRule="exact"/>
+        <w:rPr>
+          <w:sz w:val="4"/>
+        </w:rPr>
+      </w:pPr>
+    </w:p>
+    <w:p>
+      <w:pPr>
+        <w:keepNext/>
+        <w:spacing w:before="160" w:after="80"/>
+      </w:pPr>
+      <w:r>
+        <w:rPr>
+          <w:b/>
+        </w:rPr>
+        <w:t>Vraag 1. Waarom mogen de ouders in situatie c elkaars e-mailadres niet zien?</w:t>
+      </w:r>
+    </w:p>
+    <w:tbl>
+      <w:tblPr>
+        <w:tblW w:type="auto" w:w="0"/>
+        <w:jc w:val="center"/>
+        <w:tblLayout w:type="fixed"/>
+        <w:tblLook w:firstColumn="1" w:firstRow="1" w:lastColumn="0" w:lastRow="0" w:noHBand="0" w:noVBand="1" w:val="04A0"/>
+        <w:tblBorders>
+          <w:top w:val="single" w:sz="6" w:space="0" w:color="A7B1DE"/>
+          <w:left w:val="single" w:sz="6" w:space="0" w:color="A7B1DE"/>
+          <w:bottom w:val="single" w:sz="6" w:space="0" w:color="A7B1DE"/>
+          <w:right w:val="single" w:sz="6" w:space="0" w:color="A7B1DE"/>
+          <w:insideH w:val="nil"/>
+          <w:insideV w:val="nil"/>
+        </w:tblBorders>
+        <w:tblLayout w:type="fixed"/>
+      </w:tblPr>
+      <w:tblGrid>
+        <w:gridCol w:w="9638"/>
+      </w:tblGrid>
+      <w:tr>
+        <w:trPr>
+          <w:trHeight w:val="1020" w:hRule="atLeast"/>
+          <w:cantSplit/>
+        </w:trPr>
+        <w:tc>
+          <w:tcPr>
+            <w:tcW w:type="dxa" w:w="9638"/>
+            <w:shd w:val="clear" w:color="auto" w:fill="F3F5FC"/>
+          </w:tcPr>
+          <w:p>
+            <w:pPr>
+              <w:spacing w:before="0" w:after="0"/>
+            </w:pPr>
+          </w:p>
+        </w:tc>
+      </w:tr>
+    </w:tbl>
+    <w:p>
+      <w:pPr>
+        <w:spacing w:before="0" w:after="0" w:line="80" w:lineRule="exact"/>
+        <w:rPr>
+          <w:sz w:val="4"/>
+        </w:rPr>
+      </w:pPr>
+    </w:p>
+    <w:p>
+      <w:pPr>
+        <w:keepNext/>
+        <w:pageBreakBefore/>
+        <w:spacing w:before="0" w:after="160"/>
+        <w:pBdr>
+          <w:bottom w:val="single" w:sz="6" w:space="3" w:color="A7B1DE"/>
+        </w:pBdr>
+      </w:pPr>
+      <w:r>
+        <w:rPr>
+          <w:rFonts w:ascii="Montserrat" w:hAnsi="Montserrat" w:eastAsia="Montserrat"/>
+          <w:b/>
+          <w:i w:val="0"/>
+          <w:color w:val="2A3973"/>
+          <w:sz w:val="28"/>
+        </w:rPr>
+        <w:t>Deel 3 — Mijn e-mail aan mijn mentor</w:t>
+      </w:r>
+    </w:p>
+    <w:tbl>
+      <w:tblPr>
+        <w:tblW w:type="auto" w:w="0"/>
+        <w:jc w:val="center"/>
+        <w:tblLayout w:type="fixed"/>
+        <w:tblLook w:firstColumn="1" w:firstRow="1" w:lastColumn="0" w:lastRow="0" w:noHBand="0" w:noVBand="1" w:val="04A0"/>
+        <w:tblBorders>
+          <w:top w:val="single" w:sz="6" w:space="0" w:color="9AA0A6"/>
+          <w:left w:val="single" w:sz="6" w:space="0" w:color="9AA0A6"/>
+          <w:bottom w:val="single" w:sz="6" w:space="0" w:color="9AA0A6"/>
+          <w:right w:val="single" w:sz="6" w:space="0" w:color="9AA0A6"/>
+          <w:insideH w:val="nil"/>
+          <w:insideV w:val="nil"/>
+        </w:tblBorders>
+        <w:tblLayout w:type="fixed"/>
       </w:tblPr>
       <w:tblGrid>
         <w:gridCol w:w="1814"/>
         <w:gridCol w:w="7824"/>
       </w:tblGrid>
       <w:tr>
+        <w:trPr>
+          <w:trHeight w:val="453" w:hRule="atLeast"/>
+          <w:cantSplit/>
+        </w:trPr>
         <w:tc>
           <w:tcPr>
             <w:tcW w:type="dxa" w:w="9638"/>
             <w:gridSpan w:val="2"/>
-            <w:shd w:val="clear" w:fill="F2F6FC"/>
+            <w:shd w:val="clear" w:color="auto" w:fill="F2F6FC"/>
+            <w:vAlign w:val="center"/>
           </w:tcPr>
           <w:p>
+            <w:pPr>
+              <w:spacing w:before="0" w:after="0"/>
+            </w:pPr>
             <w:r/>
             <w:r>
               <w:rPr>
                 <w:b/>
+                <w:i w:val="0"/>
                 <w:color w:val="202124"/>
               </w:rPr>
               <w:t>Nieuw bericht</w:t>
@@ -629,20 +843,26 @@
       </w:tr>
       <w:tr>
         <w:trPr>
-          <w:trHeight w:val="453" w:hRule="atLeast"/>
+          <w:trHeight w:val="481" w:hRule="atLeast"/>
+          <w:cantSplit/>
         </w:trPr>
         <w:tc>
           <w:tcPr>
             <w:tcW w:type="dxa" w:w="1814"/>
+            <w:vAlign w:val="center"/>
             <w:tcBorders>
-              <w:bottom w:val="single" w:sz="6" w:color="DADCE0"/>
+              <w:bottom w:val="single" w:sz="6" w:space="0" w:color="DADCE0"/>
             </w:tcBorders>
           </w:tcPr>
           <w:p>
+            <w:pPr>
+              <w:spacing w:before="0" w:after="0"/>
+            </w:pPr>
             <w:r/>
             <w:r>
               <w:rPr>
                 <w:b w:val="0"/>
+                <w:i w:val="0"/>
                 <w:color w:val="5F6368"/>
               </w:rPr>
               <w:t>Aan</w:t>
@@ -652,29 +872,41 @@
         <w:tc>
           <w:tcPr>
             <w:tcW w:type="dxa" w:w="7824"/>
+            <w:shd w:val="clear" w:color="auto" w:fill="F3F5FC"/>
+            <w:vAlign w:val="center"/>
             <w:tcBorders>
-              <w:bottom w:val="single" w:sz="6" w:color="DADCE0"/>
+              <w:bottom w:val="single" w:sz="6" w:space="0" w:color="DADCE0"/>
             </w:tcBorders>
           </w:tcPr>
-          <w:p/>
+          <w:p>
+            <w:pPr>
+              <w:spacing w:before="0" w:after="0"/>
+            </w:pPr>
+          </w:p>
         </w:tc>
       </w:tr>
       <w:tr>
         <w:trPr>
-          <w:trHeight w:val="453" w:hRule="atLeast"/>
+          <w:trHeight w:val="481" w:hRule="atLeast"/>
+          <w:cantSplit/>
         </w:trPr>
         <w:tc>
           <w:tcPr>
             <w:tcW w:type="dxa" w:w="1814"/>
+            <w:vAlign w:val="center"/>
             <w:tcBorders>
-              <w:bottom w:val="single" w:sz="6" w:color="DADCE0"/>
+              <w:bottom w:val="single" w:sz="6" w:space="0" w:color="DADCE0"/>
             </w:tcBorders>
           </w:tcPr>
           <w:p>
+            <w:pPr>
+              <w:spacing w:before="0" w:after="0"/>
+            </w:pPr>
             <w:r/>
             <w:r>
               <w:rPr>
                 <w:b w:val="0"/>
+                <w:i w:val="0"/>
                 <w:color w:val="5F6368"/>
               </w:rPr>
               <w:t>Cc</w:t>
@@ -684,29 +916,41 @@
         <w:tc>
           <w:tcPr>
             <w:tcW w:type="dxa" w:w="7824"/>
+            <w:shd w:val="clear" w:color="auto" w:fill="F3F5FC"/>
+            <w:vAlign w:val="center"/>
             <w:tcBorders>
-              <w:bottom w:val="single" w:sz="6" w:color="DADCE0"/>
+              <w:bottom w:val="single" w:sz="6" w:space="0" w:color="DADCE0"/>
             </w:tcBorders>
           </w:tcPr>
-          <w:p/>
+          <w:p>
+            <w:pPr>
+              <w:spacing w:before="0" w:after="0"/>
+            </w:pPr>
+          </w:p>
         </w:tc>
       </w:tr>
       <w:tr>
         <w:trPr>
-          <w:trHeight w:val="453" w:hRule="atLeast"/>
+          <w:trHeight w:val="481" w:hRule="atLeast"/>
+          <w:cantSplit/>
         </w:trPr>
         <w:tc>
           <w:tcPr>
             <w:tcW w:type="dxa" w:w="1814"/>
+            <w:vAlign w:val="center"/>
             <w:tcBorders>
-              <w:bottom w:val="single" w:sz="6" w:color="DADCE0"/>
+              <w:bottom w:val="single" w:sz="6" w:space="0" w:color="DADCE0"/>
             </w:tcBorders>
           </w:tcPr>
           <w:p>
+            <w:pPr>
+              <w:spacing w:before="0" w:after="0"/>
+            </w:pPr>
             <w:r/>
             <w:r>
               <w:rPr>
                 <w:b w:val="0"/>
+                <w:i w:val="0"/>
                 <w:color w:val="5F6368"/>
               </w:rPr>
               <w:t>Bcc</w:t>
@@ -716,29 +960,41 @@
         <w:tc>
           <w:tcPr>
             <w:tcW w:type="dxa" w:w="7824"/>
+            <w:shd w:val="clear" w:color="auto" w:fill="F3F5FC"/>
+            <w:vAlign w:val="center"/>
             <w:tcBorders>
-              <w:bottom w:val="single" w:sz="6" w:color="DADCE0"/>
+              <w:bottom w:val="single" w:sz="6" w:space="0" w:color="DADCE0"/>
             </w:tcBorders>
           </w:tcPr>
-          <w:p/>
+          <w:p>
+            <w:pPr>
+              <w:spacing w:before="0" w:after="0"/>
+            </w:pPr>
+          </w:p>
         </w:tc>
       </w:tr>
       <w:tr>
         <w:trPr>
-          <w:trHeight w:val="453" w:hRule="atLeast"/>
+          <w:trHeight w:val="481" w:hRule="atLeast"/>
+          <w:cantSplit/>
         </w:trPr>
         <w:tc>
           <w:tcPr>
             <w:tcW w:type="dxa" w:w="1814"/>
+            <w:vAlign w:val="center"/>
             <w:tcBorders>
-              <w:bottom w:val="single" w:sz="6" w:color="DADCE0"/>
+              <w:bottom w:val="single" w:sz="6" w:space="0" w:color="DADCE0"/>
             </w:tcBorders>
           </w:tcPr>
           <w:p>
+            <w:pPr>
+              <w:spacing w:before="0" w:after="0"/>
+            </w:pPr>
             <w:r/>
             <w:r>
               <w:rPr>
                 <w:b w:val="0"/>
+                <w:i w:val="0"/>
                 <w:color w:val="5F6368"/>
               </w:rPr>
               <w:t>Onderwerp</w:t>
@@ -748,28 +1004,39 @@
         <w:tc>
           <w:tcPr>
             <w:tcW w:type="dxa" w:w="7824"/>
+            <w:shd w:val="clear" w:color="auto" w:fill="F3F5FC"/>
+            <w:vAlign w:val="center"/>
             <w:tcBorders>
-              <w:bottom w:val="single" w:sz="6" w:color="DADCE0"/>
+              <w:bottom w:val="single" w:sz="6" w:space="0" w:color="DADCE0"/>
             </w:tcBorders>
           </w:tcPr>
-          <w:p/>
+          <w:p>
+            <w:pPr>
+              <w:spacing w:before="0" w:after="0"/>
+            </w:pPr>
+          </w:p>
         </w:tc>
       </w:tr>
       <w:tr>
         <w:trPr>
-          <w:trHeight w:val="510" w:hRule="atLeast"/>
+          <w:trHeight w:val="567" w:hRule="atLeast"/>
+          <w:cantSplit/>
         </w:trPr>
         <w:tc>
           <w:tcPr>
             <w:tcW w:type="dxa" w:w="1814"/>
           </w:tcPr>
           <w:p>
+            <w:pPr>
+              <w:spacing w:before="0" w:after="0"/>
+            </w:pPr>
             <w:r/>
             <w:r>
               <w:rPr>
                 <w:b w:val="0"/>
+                <w:i w:val="0"/>
                 <w:color w:val="5F6368"/>
-                <w:sz w:val="17"/>
+                <w:sz w:val="20"/>
               </w:rPr>
               <w:t>aanspreking</w:t>
             </w:r>
@@ -778,25 +1045,35 @@
         <w:tc>
           <w:tcPr>
             <w:tcW w:type="dxa" w:w="7824"/>
+            <w:shd w:val="clear" w:color="auto" w:fill="F3F5FC"/>
           </w:tcPr>
-          <w:p/>
+          <w:p>
+            <w:pPr>
+              <w:spacing w:before="0" w:after="0"/>
+            </w:pPr>
+          </w:p>
         </w:tc>
       </w:tr>
       <w:tr>
         <w:trPr>
-          <w:trHeight w:val="737" w:hRule="atLeast"/>
+          <w:trHeight w:val="1020" w:hRule="atLeast"/>
+          <w:cantSplit/>
         </w:trPr>
         <w:tc>
           <w:tcPr>
             <w:tcW w:type="dxa" w:w="1814"/>
           </w:tcPr>
           <w:p>
+            <w:pPr>
+              <w:spacing w:before="0" w:after="0"/>
+            </w:pPr>
             <w:r/>
             <w:r>
               <w:rPr>
                 <w:b w:val="0"/>
+                <w:i w:val="0"/>
                 <w:color w:val="5F6368"/>
-                <w:sz w:val="17"/>
+                <w:sz w:val="20"/>
               </w:rPr>
               <w:t>wie ben je?</w:t>
             </w:r>
@@ -805,25 +1082,35 @@
         <w:tc>
           <w:tcPr>
             <w:tcW w:type="dxa" w:w="7824"/>
+            <w:shd w:val="clear" w:color="auto" w:fill="F3F5FC"/>
           </w:tcPr>
-          <w:p/>
+          <w:p>
+            <w:pPr>
+              <w:spacing w:before="0" w:after="0"/>
+            </w:pPr>
+          </w:p>
         </w:tc>
       </w:tr>
       <w:tr>
         <w:trPr>
-          <w:trHeight w:val="737" w:hRule="atLeast"/>
+          <w:trHeight w:val="1247" w:hRule="atLeast"/>
+          <w:cantSplit/>
         </w:trPr>
         <w:tc>
           <w:tcPr>
             <w:tcW w:type="dxa" w:w="1814"/>
           </w:tcPr>
           <w:p>
+            <w:pPr>
+              <w:spacing w:before="0" w:after="0"/>
+            </w:pPr>
             <w:r/>
             <w:r>
               <w:rPr>
                 <w:b w:val="0"/>
+                <w:i w:val="0"/>
                 <w:color w:val="5F6368"/>
-                <w:sz w:val="17"/>
+                <w:sz w:val="20"/>
               </w:rPr>
               <w:t>waarom mail je?</w:t>
             </w:r>
@@ -832,25 +1119,35 @@
         <w:tc>
           <w:tcPr>
             <w:tcW w:type="dxa" w:w="7824"/>
+            <w:shd w:val="clear" w:color="auto" w:fill="F3F5FC"/>
           </w:tcPr>
-          <w:p/>
+          <w:p>
+            <w:pPr>
+              <w:spacing w:before="0" w:after="0"/>
+            </w:pPr>
+          </w:p>
         </w:tc>
       </w:tr>
       <w:tr>
         <w:trPr>
-          <w:trHeight w:val="737" w:hRule="atLeast"/>
+          <w:trHeight w:val="1247" w:hRule="atLeast"/>
+          <w:cantSplit/>
         </w:trPr>
         <w:tc>
           <w:tcPr>
             <w:tcW w:type="dxa" w:w="1814"/>
           </w:tcPr>
           <w:p>
+            <w:pPr>
+              <w:spacing w:before="0" w:after="0"/>
+            </w:pPr>
             <w:r/>
             <w:r>
               <w:rPr>
                 <w:b w:val="0"/>
+                <w:i w:val="0"/>
                 <w:color w:val="5F6368"/>
-                <w:sz w:val="17"/>
+                <w:sz w:val="20"/>
               </w:rPr>
               <w:t>je vraag</w:t>
             </w:r>
@@ -859,25 +1156,35 @@
         <w:tc>
           <w:tcPr>
             <w:tcW w:type="dxa" w:w="7824"/>
+            <w:shd w:val="clear" w:color="auto" w:fill="F3F5FC"/>
           </w:tcPr>
-          <w:p/>
+          <w:p>
+            <w:pPr>
+              <w:spacing w:before="0" w:after="0"/>
+            </w:pPr>
+          </w:p>
         </w:tc>
       </w:tr>
       <w:tr>
         <w:trPr>
-          <w:trHeight w:val="737" w:hRule="atLeast"/>
+          <w:trHeight w:val="680" w:hRule="atLeast"/>
+          <w:cantSplit/>
         </w:trPr>
         <w:tc>
           <w:tcPr>
             <w:tcW w:type="dxa" w:w="1814"/>
           </w:tcPr>
           <w:p>
+            <w:pPr>
+              <w:spacing w:before="0" w:after="0"/>
+            </w:pPr>
             <w:r/>
             <w:r>
               <w:rPr>
                 <w:b w:val="0"/>
+                <w:i w:val="0"/>
                 <w:color w:val="5F6368"/>
-                <w:sz w:val="17"/>
+                <w:sz w:val="20"/>
               </w:rPr>
               <w:t>slotgroet</w:t>
             </w:r>
@@ -886,256 +1193,819 @@
         <w:tc>
           <w:tcPr>
             <w:tcW w:type="dxa" w:w="7824"/>
+            <w:shd w:val="clear" w:color="auto" w:fill="F3F5FC"/>
           </w:tcPr>
-          <w:p/>
+          <w:p>
+            <w:pPr>
+              <w:spacing w:before="0" w:after="0"/>
+            </w:pPr>
+          </w:p>
         </w:tc>
       </w:tr>
       <w:tr>
         <w:trPr>
-          <w:trHeight w:val="737" w:hRule="atLeast"/>
+          <w:trHeight w:val="1020" w:hRule="atLeast"/>
+          <w:cantSplit/>
         </w:trPr>
         <w:tc>
           <w:tcPr>
             <w:tcW w:type="dxa" w:w="1814"/>
           </w:tcPr>
           <w:p>
+            <w:pPr>
+              <w:spacing w:before="0" w:after="0"/>
+            </w:pPr>
             <w:r/>
             <w:r>
               <w:rPr>
                 <w:b w:val="0"/>
+                <w:i w:val="0"/>
                 <w:color w:val="5F6368"/>
-                <w:sz w:val="17"/>
+                <w:sz w:val="20"/>
               </w:rPr>
-              <w:t>je naam,</w:t>
-              <w:br/>
-              <w:t>klas en school</w:t>
+              <w:t>je naam, klas en school</w:t>
             </w:r>
           </w:p>
         </w:tc>
         <w:tc>
           <w:tcPr>
             <w:tcW w:type="dxa" w:w="7824"/>
-          </w:tcPr>
-          <w:p/>
-        </w:tc>
-      </w:tr>
-      <w:tr>
-        <w:tc>
-          <w:tcPr>
-            <w:tcW w:type="dxa" w:w="1814"/>
-            <w:shd w:val="clear" w:fill="0B57D0"/>
+            <w:shd w:val="clear" w:color="auto" w:fill="F3F5FC"/>
           </w:tcPr>
           <w:p>
             <w:pPr>
+              <w:spacing w:before="0" w:after="0"/>
+            </w:pPr>
+          </w:p>
+        </w:tc>
+      </w:tr>
+    </w:tbl>
+    <w:p>
+      <w:pPr>
+        <w:keepNext/>
+        <w:pageBreakBefore/>
+        <w:spacing w:before="0" w:after="160"/>
+        <w:pBdr>
+          <w:bottom w:val="single" w:sz="6" w:space="3" w:color="A7B1DE"/>
+        </w:pBdr>
+      </w:pPr>
+      <w:r>
+        <w:rPr>
+          <w:rFonts w:ascii="Montserrat" w:hAnsi="Montserrat" w:eastAsia="Montserrat"/>
+          <w:b/>
+          <w:i w:val="0"/>
+          <w:color w:val="2A3973"/>
+          <w:sz w:val="28"/>
+        </w:rPr>
+        <w:t>Deel 4 — Nalezen</w:t>
+      </w:r>
+    </w:p>
+    <w:tbl>
+      <w:tblPr>
+        <w:tblW w:type="auto" w:w="0"/>
+        <w:jc w:val="center"/>
+        <w:tblLayout w:type="fixed"/>
+        <w:tblLook w:firstColumn="1" w:firstRow="1" w:lastColumn="0" w:lastRow="0" w:noHBand="0" w:noVBand="1" w:val="04A0"/>
+        <w:tblBorders>
+          <w:top w:val="single" w:sz="6" w:space="0" w:color="A7B1DE"/>
+          <w:left w:val="single" w:sz="6" w:space="0" w:color="A7B1DE"/>
+          <w:bottom w:val="single" w:sz="6" w:space="0" w:color="A7B1DE"/>
+          <w:right w:val="single" w:sz="6" w:space="0" w:color="A7B1DE"/>
+          <w:insideH w:val="single" w:sz="6" w:space="0" w:color="D5DAEE"/>
+          <w:insideV w:val="single" w:sz="6" w:space="0" w:color="D5DAEE"/>
+        </w:tblBorders>
+        <w:tblLayout w:type="fixed"/>
+      </w:tblPr>
+      <w:tblGrid>
+        <w:gridCol w:w="907"/>
+        <w:gridCol w:w="7597"/>
+        <w:gridCol w:w="1134"/>
+      </w:tblGrid>
+      <w:tr>
+        <w:trPr>
+          <w:cantSplit/>
+        </w:trPr>
+        <w:tc>
+          <w:tcPr>
+            <w:tcW w:type="dxa" w:w="907"/>
+            <w:shd w:val="clear" w:color="auto" w:fill="E4E8F6"/>
+          </w:tcPr>
+          <w:p>
+            <w:pPr>
+              <w:spacing w:before="0" w:after="0"/>
               <w:jc w:val="center"/>
             </w:pPr>
             <w:r/>
             <w:r>
               <w:rPr>
                 <w:b/>
-                <w:color w:val="FFFFFF"/>
+                <w:i w:val="0"/>
+                <w:color w:val="2A3973"/>
+                <w:sz w:val="22"/>
               </w:rPr>
-              <w:t>Verzenden</w:t>
+              <w:t>Klopt?</w:t>
             </w:r>
           </w:p>
         </w:tc>
         <w:tc>
           <w:tcPr>
-            <w:tcW w:type="dxa" w:w="7824"/>
+            <w:tcW w:type="dxa" w:w="7597"/>
+            <w:shd w:val="clear" w:color="auto" w:fill="E4E8F6"/>
           </w:tcPr>
           <w:p>
+            <w:pPr>
+              <w:spacing w:before="0" w:after="0"/>
+            </w:pPr>
+            <w:r/>
+            <w:r>
+              <w:rPr>
+                <w:b/>
+                <w:i w:val="0"/>
+                <w:color w:val="2A3973"/>
+                <w:sz w:val="22"/>
+              </w:rPr>
+              <w:t>Wat moet kloppen?</w:t>
+            </w:r>
+          </w:p>
+        </w:tc>
+        <w:tc>
+          <w:tcPr>
+            <w:tcW w:type="dxa" w:w="1134"/>
+            <w:shd w:val="clear" w:color="auto" w:fill="E4E8F6"/>
+          </w:tcPr>
+          <w:p>
+            <w:pPr>
+              <w:spacing w:before="0" w:after="0"/>
+              <w:jc w:val="center"/>
+            </w:pPr>
+            <w:r/>
+            <w:r>
+              <w:rPr>
+                <w:b/>
+                <w:i w:val="0"/>
+                <w:color w:val="2A3973"/>
+                <w:sz w:val="22"/>
+              </w:rPr>
+              <w:t>Punten</w:t>
+            </w:r>
+          </w:p>
+        </w:tc>
+      </w:tr>
+      <w:tr>
+        <w:trPr>
+          <w:trHeight w:val="510" w:hRule="atLeast"/>
+          <w:cantSplit/>
+        </w:trPr>
+        <w:tc>
+          <w:tcPr>
+            <w:tcW w:type="dxa" w:w="907"/>
+            <w:shd w:val="clear" w:color="auto" w:fill="F3F5FC"/>
+            <w:vAlign w:val="center"/>
+          </w:tcPr>
+          <w:p>
+            <w:pPr>
+              <w:spacing w:before="0" w:after="0"/>
+              <w:jc w:val="center"/>
+            </w:pPr>
+          </w:p>
+        </w:tc>
+        <w:tc>
+          <w:tcPr>
+            <w:tcW w:type="dxa" w:w="7597"/>
+            <w:vAlign w:val="center"/>
+          </w:tcPr>
+          <w:p>
+            <w:pPr>
+              <w:spacing w:before="0" w:after="0"/>
+            </w:pPr>
             <w:r/>
             <w:r>
               <w:rPr>
                 <w:b w:val="0"/>
+                <w:i w:val="0"/>
+              </w:rPr>
+              <w:t>Bij Aan staat het adres van mijn mentor, bij Cc dat van mijn stagebegeleider. Bcc is leeg.</w:t>
+            </w:r>
+          </w:p>
+        </w:tc>
+        <w:tc>
+          <w:tcPr>
+            <w:tcW w:type="dxa" w:w="1134"/>
+            <w:vAlign w:val="center"/>
+          </w:tcPr>
+          <w:p>
+            <w:pPr>
+              <w:jc w:val="right"/>
+            </w:pPr>
+            <w:r>
+              <w:rPr>
+                <w:rFonts w:ascii="Calibri" w:hAnsi="Calibri" w:eastAsia="Calibri"/>
+                <w:b w:val="0"/>
+                <w:i w:val="0"/>
                 <w:color w:val="5F6368"/>
-                <w:sz w:val="18"/>
+                <w:sz w:val="24"/>
               </w:rPr>
-              <w:t>Niet echt: je levert dit document in, in Classroom.</w:t>
+              <w:t>/ 3</w:t>
+            </w:r>
+          </w:p>
+        </w:tc>
+      </w:tr>
+      <w:tr>
+        <w:trPr>
+          <w:trHeight w:val="510" w:hRule="atLeast"/>
+          <w:cantSplit/>
+        </w:trPr>
+        <w:tc>
+          <w:tcPr>
+            <w:tcW w:type="dxa" w:w="907"/>
+            <w:shd w:val="clear" w:color="auto" w:fill="F3F5FC"/>
+            <w:vAlign w:val="center"/>
+          </w:tcPr>
+          <w:p>
+            <w:pPr>
+              <w:spacing w:before="0" w:after="0"/>
+              <w:jc w:val="center"/>
+            </w:pPr>
+          </w:p>
+        </w:tc>
+        <w:tc>
+          <w:tcPr>
+            <w:tcW w:type="dxa" w:w="7597"/>
+            <w:vAlign w:val="center"/>
+          </w:tcPr>
+          <w:p>
+            <w:pPr>
+              <w:spacing w:before="0" w:after="0"/>
+            </w:pPr>
+            <w:r/>
+            <w:r>
+              <w:rPr>
+                <w:b w:val="0"/>
+                <w:i w:val="0"/>
+              </w:rPr>
+              <w:t>Mijn onderwerp zegt in een paar woorden wie ik ben en waarover mijn e-mail gaat.</w:t>
+            </w:r>
+          </w:p>
+        </w:tc>
+        <w:tc>
+          <w:tcPr>
+            <w:tcW w:type="dxa" w:w="1134"/>
+            <w:vAlign w:val="center"/>
+          </w:tcPr>
+          <w:p>
+            <w:pPr>
+              <w:jc w:val="right"/>
+            </w:pPr>
+            <w:r>
+              <w:rPr>
+                <w:rFonts w:ascii="Calibri" w:hAnsi="Calibri" w:eastAsia="Calibri"/>
+                <w:b w:val="0"/>
+                <w:i w:val="0"/>
+                <w:color w:val="5F6368"/>
+                <w:sz w:val="24"/>
+              </w:rPr>
+              <w:t>/ 3</w:t>
+            </w:r>
+          </w:p>
+        </w:tc>
+      </w:tr>
+      <w:tr>
+        <w:trPr>
+          <w:trHeight w:val="510" w:hRule="atLeast"/>
+          <w:cantSplit/>
+        </w:trPr>
+        <w:tc>
+          <w:tcPr>
+            <w:tcW w:type="dxa" w:w="907"/>
+            <w:shd w:val="clear" w:color="auto" w:fill="F3F5FC"/>
+            <w:vAlign w:val="center"/>
+          </w:tcPr>
+          <w:p>
+            <w:pPr>
+              <w:spacing w:before="0" w:after="0"/>
+              <w:jc w:val="center"/>
+            </w:pPr>
+          </w:p>
+        </w:tc>
+        <w:tc>
+          <w:tcPr>
+            <w:tcW w:type="dxa" w:w="7597"/>
+            <w:vAlign w:val="center"/>
+          </w:tcPr>
+          <w:p>
+            <w:pPr>
+              <w:spacing w:before="0" w:after="0"/>
+            </w:pPr>
+            <w:r/>
+            <w:r>
+              <w:rPr>
+                <w:b w:val="0"/>
+                <w:i w:val="0"/>
+              </w:rPr>
+              <w:t xml:space="preserve">Ik begin met </w:t>
+            </w:r>
+            <w:r>
+              <w:rPr>
+                <w:b w:val="0"/>
+                <w:i/>
+              </w:rPr>
+              <w:t>Beste mevrouw Verhoeven,</w:t>
+            </w:r>
+            <w:r>
+              <w:rPr>
+                <w:b w:val="0"/>
+                <w:i w:val="0"/>
+              </w:rPr>
+              <w:t xml:space="preserve"> en sluit af met </w:t>
+            </w:r>
+            <w:r>
+              <w:rPr>
+                <w:b w:val="0"/>
+                <w:i/>
+              </w:rPr>
+              <w:t>Met vriendelijke groeten,</w:t>
+            </w:r>
+            <w:r>
+              <w:rPr>
+                <w:b w:val="0"/>
+                <w:i w:val="0"/>
+              </w:rPr>
+              <w:t xml:space="preserve"> met daaronder mijn voornaam en achternaam, klas en school.</w:t>
+            </w:r>
+          </w:p>
+        </w:tc>
+        <w:tc>
+          <w:tcPr>
+            <w:tcW w:type="dxa" w:w="1134"/>
+            <w:vAlign w:val="center"/>
+          </w:tcPr>
+          <w:p>
+            <w:pPr>
+              <w:jc w:val="right"/>
+            </w:pPr>
+            <w:r>
+              <w:rPr>
+                <w:rFonts w:ascii="Calibri" w:hAnsi="Calibri" w:eastAsia="Calibri"/>
+                <w:b w:val="0"/>
+                <w:i w:val="0"/>
+                <w:color w:val="5F6368"/>
+                <w:sz w:val="24"/>
+              </w:rPr>
+              <w:t>/ 4</w:t>
+            </w:r>
+          </w:p>
+        </w:tc>
+      </w:tr>
+      <w:tr>
+        <w:trPr>
+          <w:trHeight w:val="510" w:hRule="atLeast"/>
+          <w:cantSplit/>
+        </w:trPr>
+        <w:tc>
+          <w:tcPr>
+            <w:tcW w:type="dxa" w:w="907"/>
+            <w:shd w:val="clear" w:color="auto" w:fill="F3F5FC"/>
+            <w:vAlign w:val="center"/>
+          </w:tcPr>
+          <w:p>
+            <w:pPr>
+              <w:spacing w:before="0" w:after="0"/>
+              <w:jc w:val="center"/>
+            </w:pPr>
+          </w:p>
+        </w:tc>
+        <w:tc>
+          <w:tcPr>
+            <w:tcW w:type="dxa" w:w="7597"/>
+            <w:vAlign w:val="center"/>
+          </w:tcPr>
+          <w:p>
+            <w:pPr>
+              <w:spacing w:before="0" w:after="0"/>
+            </w:pPr>
+            <w:r/>
+            <w:r>
+              <w:rPr>
+                <w:b w:val="0"/>
+                <w:i w:val="0"/>
+              </w:rPr>
+              <w:t>Ik zeg wie ik ben, waarom ik mail en wat ik vraag.</w:t>
+            </w:r>
+          </w:p>
+        </w:tc>
+        <w:tc>
+          <w:tcPr>
+            <w:tcW w:type="dxa" w:w="1134"/>
+            <w:vAlign w:val="center"/>
+          </w:tcPr>
+          <w:p>
+            <w:pPr>
+              <w:jc w:val="right"/>
+            </w:pPr>
+            <w:r>
+              <w:rPr>
+                <w:rFonts w:ascii="Calibri" w:hAnsi="Calibri" w:eastAsia="Calibri"/>
+                <w:b w:val="0"/>
+                <w:i w:val="0"/>
+                <w:color w:val="5F6368"/>
+                <w:sz w:val="24"/>
+              </w:rPr>
+              <w:t>/ 5</w:t>
+            </w:r>
+          </w:p>
+        </w:tc>
+      </w:tr>
+      <w:tr>
+        <w:trPr>
+          <w:trHeight w:val="510" w:hRule="atLeast"/>
+          <w:cantSplit/>
+        </w:trPr>
+        <w:tc>
+          <w:tcPr>
+            <w:tcW w:type="dxa" w:w="907"/>
+            <w:shd w:val="clear" w:color="auto" w:fill="F3F5FC"/>
+            <w:vAlign w:val="center"/>
+          </w:tcPr>
+          <w:p>
+            <w:pPr>
+              <w:spacing w:before="0" w:after="0"/>
+              <w:jc w:val="center"/>
+            </w:pPr>
+          </w:p>
+        </w:tc>
+        <w:tc>
+          <w:tcPr>
+            <w:tcW w:type="dxa" w:w="7597"/>
+            <w:vAlign w:val="center"/>
+          </w:tcPr>
+          <w:p>
+            <w:pPr>
+              <w:spacing w:before="0" w:after="0"/>
+            </w:pPr>
+            <w:r/>
+            <w:r>
+              <w:rPr>
+                <w:b w:val="0"/>
+                <w:i w:val="0"/>
+              </w:rPr>
+              <w:t xml:space="preserve">Ik schrijf overal </w:t>
+            </w:r>
+            <w:r>
+              <w:rPr>
+                <w:b w:val="0"/>
+                <w:i/>
+              </w:rPr>
+              <w:t>u</w:t>
+            </w:r>
+            <w:r>
+              <w:rPr>
+                <w:b w:val="0"/>
+                <w:i w:val="0"/>
+              </w:rPr>
+              <w:t xml:space="preserve"> en </w:t>
+            </w:r>
+            <w:r>
+              <w:rPr>
+                <w:b w:val="0"/>
+                <w:i/>
+              </w:rPr>
+              <w:t>uw</w:t>
+            </w:r>
+            <w:r>
+              <w:rPr>
+                <w:b w:val="0"/>
+                <w:i w:val="0"/>
+              </w:rPr>
+              <w:t xml:space="preserve">, niet </w:t>
+            </w:r>
+            <w:r>
+              <w:rPr>
+                <w:b w:val="0"/>
+                <w:i/>
+              </w:rPr>
+              <w:t>je</w:t>
+            </w:r>
+            <w:r>
+              <w:rPr>
+                <w:b w:val="0"/>
+                <w:i w:val="0"/>
+              </w:rPr>
+              <w:t xml:space="preserve"> en </w:t>
+            </w:r>
+            <w:r>
+              <w:rPr>
+                <w:b w:val="0"/>
+                <w:i/>
+              </w:rPr>
+              <w:t>jij</w:t>
+            </w:r>
+            <w:r>
+              <w:rPr>
+                <w:b w:val="0"/>
+                <w:i w:val="0"/>
+              </w:rPr>
+              <w:t xml:space="preserve">. Geen emoji's, geen chattaal, geen afkortingen zoals </w:t>
+            </w:r>
+            <w:r>
+              <w:rPr>
+                <w:b w:val="0"/>
+                <w:i/>
+              </w:rPr>
+              <w:t>mvg</w:t>
+            </w:r>
+            <w:r>
+              <w:rPr>
+                <w:b w:val="0"/>
+                <w:i w:val="0"/>
+              </w:rPr>
+              <w:t>.</w:t>
+            </w:r>
+          </w:p>
+        </w:tc>
+        <w:tc>
+          <w:tcPr>
+            <w:tcW w:type="dxa" w:w="1134"/>
+            <w:vAlign w:val="center"/>
+          </w:tcPr>
+          <w:p>
+            <w:pPr>
+              <w:jc w:val="right"/>
+            </w:pPr>
+            <w:r>
+              <w:rPr>
+                <w:rFonts w:ascii="Calibri" w:hAnsi="Calibri" w:eastAsia="Calibri"/>
+                <w:b w:val="0"/>
+                <w:i w:val="0"/>
+                <w:color w:val="5F6368"/>
+                <w:sz w:val="24"/>
+              </w:rPr>
+              <w:t>/ 3</w:t>
+            </w:r>
+          </w:p>
+        </w:tc>
+      </w:tr>
+      <w:tr>
+        <w:trPr>
+          <w:trHeight w:val="510" w:hRule="atLeast"/>
+          <w:cantSplit/>
+        </w:trPr>
+        <w:tc>
+          <w:tcPr>
+            <w:tcW w:type="dxa" w:w="907"/>
+            <w:shd w:val="clear" w:color="auto" w:fill="F3F5FC"/>
+            <w:vAlign w:val="center"/>
+          </w:tcPr>
+          <w:p>
+            <w:pPr>
+              <w:spacing w:before="0" w:after="0"/>
+              <w:jc w:val="center"/>
+            </w:pPr>
+          </w:p>
+        </w:tc>
+        <w:tc>
+          <w:tcPr>
+            <w:tcW w:type="dxa" w:w="7597"/>
+            <w:vAlign w:val="center"/>
+          </w:tcPr>
+          <w:p>
+            <w:pPr>
+              <w:spacing w:before="0" w:after="0"/>
+            </w:pPr>
+            <w:r/>
+            <w:r>
+              <w:rPr>
+                <w:b w:val="0"/>
+                <w:i w:val="0"/>
+              </w:rPr>
+              <w:t>Deel 1 en 2 zijn ingevuld.</w:t>
+            </w:r>
+          </w:p>
+        </w:tc>
+        <w:tc>
+          <w:tcPr>
+            <w:tcW w:type="dxa" w:w="1134"/>
+            <w:vAlign w:val="center"/>
+          </w:tcPr>
+          <w:p>
+            <w:pPr>
+              <w:jc w:val="right"/>
+            </w:pPr>
+            <w:r>
+              <w:rPr>
+                <w:rFonts w:ascii="Calibri" w:hAnsi="Calibri" w:eastAsia="Calibri"/>
+                <w:b w:val="0"/>
+                <w:i w:val="0"/>
+                <w:color w:val="5F6368"/>
+                <w:sz w:val="24"/>
+              </w:rPr>
+              <w:t>/ 2</w:t>
             </w:r>
           </w:p>
         </w:tc>
       </w:tr>
     </w:tbl>
-    <w:p/>
+    <w:p>
+      <w:pPr>
+        <w:spacing w:before="0" w:after="0" w:line="80" w:lineRule="exact"/>
+        <w:rPr>
+          <w:sz w:val="4"/>
+        </w:rPr>
+      </w:pPr>
+    </w:p>
     <w:p>
       <w:pPr>
         <w:keepNext/>
-        <w:spacing w:before="280" w:after="80"/>
+        <w:spacing w:before="160" w:after="80"/>
       </w:pPr>
       <w:r>
         <w:rPr>
           <w:b/>
-          <w:color w:val="2A3973"/>
-          <w:sz w:val="32"/>
         </w:rPr>
-        <w:t>Deel 4 — Nalezen</w:t>
+        <w:t>Je testlezer: laat je buur je e-mail lezen. Welke tip gaf je buur?</w:t>
       </w:r>
+    </w:p>
+    <w:tbl>
+      <w:tblPr>
+        <w:tblW w:type="auto" w:w="0"/>
+        <w:jc w:val="center"/>
+        <w:tblLayout w:type="fixed"/>
+        <w:tblLook w:firstColumn="1" w:firstRow="1" w:lastColumn="0" w:lastRow="0" w:noHBand="0" w:noVBand="1" w:val="04A0"/>
+        <w:tblBorders>
+          <w:top w:val="single" w:sz="6" w:space="0" w:color="A7B1DE"/>
+          <w:left w:val="single" w:sz="6" w:space="0" w:color="A7B1DE"/>
+          <w:bottom w:val="single" w:sz="6" w:space="0" w:color="A7B1DE"/>
+          <w:right w:val="single" w:sz="6" w:space="0" w:color="A7B1DE"/>
+          <w:insideH w:val="nil"/>
+          <w:insideV w:val="nil"/>
+        </w:tblBorders>
+        <w:tblLayout w:type="fixed"/>
+      </w:tblPr>
+      <w:tblGrid>
+        <w:gridCol w:w="9638"/>
+      </w:tblGrid>
+      <w:tr>
+        <w:trPr>
+          <w:trHeight w:val="680" w:hRule="atLeast"/>
+          <w:cantSplit/>
+        </w:trPr>
+        <w:tc>
+          <w:tcPr>
+            <w:tcW w:type="dxa" w:w="9638"/>
+            <w:shd w:val="clear" w:color="auto" w:fill="F3F5FC"/>
+          </w:tcPr>
+          <w:p>
+            <w:pPr>
+              <w:spacing w:before="0" w:after="0"/>
+            </w:pPr>
+          </w:p>
+        </w:tc>
+      </w:tr>
+    </w:tbl>
+    <w:p>
+      <w:pPr>
+        <w:spacing w:before="0" w:after="0" w:line="80" w:lineRule="exact"/>
+        <w:rPr>
+          <w:sz w:val="4"/>
+        </w:rPr>
+      </w:pPr>
     </w:p>
     <w:p>
       <w:pPr>
-        <w:spacing w:after="120"/>
-      </w:pPr>
-      <w:r>
-        <w:rPr>
-          <w:b w:val="0"/>
-          <w:i w:val="0"/>
-          <w:color w:val="5F6368"/>
-          <w:sz w:val="19"/>
-        </w:rPr>
-        <w:t>Kruis aan wat klopt. Klopt iets nog niet? Verbeter je e-mail eerst.</w:t>
-      </w:r>
-    </w:p>
-    <w:p>
-      <w:pPr>
-        <w:spacing w:after="40"/>
-      </w:pPr>
-      <w:r>
-        <w:t>☐  Bij Aan staat het adres van mijn mentor.</w:t>
-      </w:r>
-    </w:p>
-    <w:p>
-      <w:pPr>
-        <w:spacing w:after="40"/>
-      </w:pPr>
-      <w:r>
-        <w:t>☐  Bij Cc staat het adres van mijn stagebegeleider. Bcc is leeg.</w:t>
-      </w:r>
-    </w:p>
-    <w:p>
-      <w:pPr>
-        <w:spacing w:after="40"/>
-      </w:pPr>
-      <w:r>
-        <w:t>☐  Mijn onderwerp zegt in een paar woorden waarover mijn e-mail gaat.</w:t>
-      </w:r>
-    </w:p>
-    <w:p>
-      <w:pPr>
-        <w:spacing w:after="40"/>
-      </w:pPr>
-      <w:r>
-        <w:t>☐  Mijn aanspreking is: Beste mevrouw Verhoeven,</w:t>
-      </w:r>
-    </w:p>
-    <w:p>
-      <w:pPr>
-        <w:spacing w:after="40"/>
-      </w:pPr>
-      <w:r>
-        <w:t>☐  Ik schrijf overal u en uw, niet je en jij.</w:t>
-      </w:r>
-    </w:p>
-    <w:p>
-      <w:pPr>
-        <w:spacing w:after="40"/>
-      </w:pPr>
-      <w:r>
-        <w:t>☐  Ik zeg wie ik ben, waarom ik mail en wat ik vraag.</w:t>
-      </w:r>
-    </w:p>
-    <w:p>
-      <w:pPr>
-        <w:spacing w:after="40"/>
-      </w:pPr>
-      <w:r>
-        <w:t>☐  Mijn slotgroet is: Met vriendelijke groeten, met daaronder mijn voornaam en achternaam, klas en school.</w:t>
-      </w:r>
-    </w:p>
-    <w:p>
-      <w:pPr>
-        <w:spacing w:after="40"/>
-      </w:pPr>
-      <w:r>
-        <w:t>☐  Geen emoji's, geen chattaal, geen afkortingen zoals mvg.</w:t>
-      </w:r>
-    </w:p>
-    <w:p/>
-    <w:p>
-      <w:pPr>
-        <w:spacing w:after="120"/>
+        <w:keepNext/>
+        <w:spacing w:before="160" w:after="80"/>
       </w:pPr>
       <w:r>
         <w:rPr>
           <w:b/>
-          <w:i w:val="0"/>
-        </w:rPr>
-        <w:t>Je testlezer: laat je buur je e-mail lezen. Welke tip gaf je buur?</w:t>
-      </w:r>
-    </w:p>
-    <w:p>
-      <w:pPr>
-        <w:spacing w:after="40"/>
-      </w:pPr>
-      <w:r>
-        <w:t>______________________________________________________________________</w:t>
-      </w:r>
-    </w:p>
-    <w:p>
-      <w:pPr>
-        <w:spacing w:after="120"/>
-      </w:pPr>
-      <w:r>
-        <w:rPr>
-          <w:b/>
-          <w:i w:val="0"/>
         </w:rPr>
         <w:t>Wat heb je daardoor aangepast?</w:t>
       </w:r>
     </w:p>
+    <w:tbl>
+      <w:tblPr>
+        <w:tblW w:type="auto" w:w="0"/>
+        <w:jc w:val="center"/>
+        <w:tblLayout w:type="fixed"/>
+        <w:tblLook w:firstColumn="1" w:firstRow="1" w:lastColumn="0" w:lastRow="0" w:noHBand="0" w:noVBand="1" w:val="04A0"/>
+        <w:tblBorders>
+          <w:top w:val="single" w:sz="6" w:space="0" w:color="A7B1DE"/>
+          <w:left w:val="single" w:sz="6" w:space="0" w:color="A7B1DE"/>
+          <w:bottom w:val="single" w:sz="6" w:space="0" w:color="A7B1DE"/>
+          <w:right w:val="single" w:sz="6" w:space="0" w:color="A7B1DE"/>
+          <w:insideH w:val="nil"/>
+          <w:insideV w:val="nil"/>
+        </w:tblBorders>
+        <w:tblLayout w:type="fixed"/>
+      </w:tblPr>
+      <w:tblGrid>
+        <w:gridCol w:w="9638"/>
+      </w:tblGrid>
+      <w:tr>
+        <w:trPr>
+          <w:trHeight w:val="680" w:hRule="atLeast"/>
+          <w:cantSplit/>
+        </w:trPr>
+        <w:tc>
+          <w:tcPr>
+            <w:tcW w:type="dxa" w:w="9638"/>
+            <w:shd w:val="clear" w:color="auto" w:fill="F3F5FC"/>
+          </w:tcPr>
+          <w:p>
+            <w:pPr>
+              <w:spacing w:before="0" w:after="0"/>
+            </w:pPr>
+          </w:p>
+        </w:tc>
+      </w:tr>
+    </w:tbl>
     <w:p>
       <w:pPr>
-        <w:spacing w:after="40"/>
+        <w:spacing w:before="0" w:after="0" w:line="80" w:lineRule="exact"/>
+        <w:rPr>
+          <w:sz w:val="4"/>
+        </w:rPr>
       </w:pPr>
-      <w:r>
-        <w:t>______________________________________________________________________</w:t>
-      </w:r>
     </w:p>
     <w:p>
       <w:pPr>
         <w:keepNext/>
-        <w:spacing w:before="280" w:after="80"/>
+        <w:pageBreakBefore w:val="0"/>
+        <w:spacing w:before="280" w:after="160"/>
+        <w:pBdr>
+          <w:bottom w:val="single" w:sz="6" w:space="3" w:color="A7B1DE"/>
+        </w:pBdr>
       </w:pPr>
       <w:r>
         <w:rPr>
+          <w:rFonts w:ascii="Montserrat" w:hAnsi="Montserrat" w:eastAsia="Montserrat"/>
           <w:b/>
+          <w:i w:val="0"/>
           <w:color w:val="2A3973"/>
-          <w:sz w:val="32"/>
+          <w:sz w:val="28"/>
         </w:rPr>
         <w:t>Deel 5 — Slotvraag</w:t>
       </w:r>
     </w:p>
     <w:p>
       <w:pPr>
-        <w:spacing w:after="120"/>
+        <w:keepNext/>
+        <w:spacing w:before="160" w:after="80"/>
       </w:pPr>
       <w:r>
         <w:rPr>
           <w:b/>
-          <w:i w:val="0"/>
         </w:rPr>
-        <w:t>Vraag 2. Je mentor krijgt elke dag veel e-mails. Waarom helpt een duidelijk onderwerp haar?</w:t>
+        <w:t>Je mentor krijgt elke dag veel e-mails. Waarom helpt een duidelijk onderwerp haar?</w:t>
       </w:r>
     </w:p>
+    <w:tbl>
+      <w:tblPr>
+        <w:tblW w:type="auto" w:w="0"/>
+        <w:jc w:val="center"/>
+        <w:tblLayout w:type="fixed"/>
+        <w:tblLook w:firstColumn="1" w:firstRow="1" w:lastColumn="0" w:lastRow="0" w:noHBand="0" w:noVBand="1" w:val="04A0"/>
+        <w:tblBorders>
+          <w:top w:val="single" w:sz="6" w:space="0" w:color="A7B1DE"/>
+          <w:left w:val="single" w:sz="6" w:space="0" w:color="A7B1DE"/>
+          <w:bottom w:val="single" w:sz="6" w:space="0" w:color="A7B1DE"/>
+          <w:right w:val="single" w:sz="6" w:space="0" w:color="A7B1DE"/>
+          <w:insideH w:val="nil"/>
+          <w:insideV w:val="nil"/>
+        </w:tblBorders>
+        <w:tblLayout w:type="fixed"/>
+      </w:tblPr>
+      <w:tblGrid>
+        <w:gridCol w:w="9638"/>
+      </w:tblGrid>
+      <w:tr>
+        <w:trPr>
+          <w:trHeight w:val="1020" w:hRule="atLeast"/>
+          <w:cantSplit/>
+        </w:trPr>
+        <w:tc>
+          <w:tcPr>
+            <w:tcW w:type="dxa" w:w="9638"/>
+            <w:shd w:val="clear" w:color="auto" w:fill="F3F5FC"/>
+          </w:tcPr>
+          <w:p>
+            <w:pPr>
+              <w:spacing w:before="0" w:after="0"/>
+            </w:pPr>
+          </w:p>
+        </w:tc>
+      </w:tr>
+    </w:tbl>
     <w:p>
       <w:pPr>
-        <w:spacing w:after="40"/>
+        <w:spacing w:before="0" w:after="0" w:line="80" w:lineRule="exact"/>
+        <w:rPr>
+          <w:sz w:val="4"/>
+        </w:rPr>
       </w:pPr>
-      <w:r>
-        <w:t>______________________________________________________________________</w:t>
-      </w:r>
-    </w:p>
-    <w:p>
-      <w:pPr>
-        <w:spacing w:after="40"/>
-      </w:pPr>
-      <w:r>
-        <w:t>______________________________________________________________________</w:t>
-      </w:r>
     </w:p>
     <w:sectPr>
-      <w:pgSz w:w="12240" w:h="15840"/>
-      <w:pgMar w:top="1134" w:right="1134" w:bottom="1134" w:left="1134" w:header="720" w:footer="720" w:gutter="0"/>
+      <w:pgSz w:w="11906" w:h="16838"/>
+      <w:pgMar w:top="1020" w:right="1134" w:bottom="1020" w:left="1134" w:header="720" w:footer="720" w:gutter="0"/>
       <w:cols w:space="720"/>
       <w:docGrid w:linePitch="360"/>
     </w:sectPr>
@@ -1506,9 +2376,13 @@
     <w:name w:val="Normal"/>
     <w:qFormat/>
     <w:rsid w:val="00FC693F"/>
+    <w:pPr>
+      <w:spacing w:after="80" w:line="264" w:lineRule="auto"/>
+    </w:pPr>
     <w:rPr>
-      <w:rFonts w:ascii="Arial" w:hAnsi="Arial" w:eastAsia="Arial"/>
-      <w:sz w:val="22"/>
+      <w:rFonts w:ascii="Calibri" w:hAnsi="Calibri" w:eastAsia="Calibri"/>
+      <w:color w:val="1F1F1F"/>
+      <w:sz w:val="24"/>
     </w:rPr>
   </w:style>
   <w:style w:type="paragraph" w:styleId="Header">

</xml_diff>